<commit_message>
Upgrade binding pose figures to PyMOL rendering
</commit_message>
<xml_diff>
--- a/manuscript/manuscript.docx
+++ b/manuscript/manuscript.docx
@@ -1120,7 +1120,7 @@
       <w:r>
         <w:drawing>
           <wp:inline distT="0" distB="0" distL="0" distR="0">
-            <wp:extent cx="5734050" cy="5095875"/>
+            <wp:extent cx="5734050" cy="5019675"/>
             <wp:effectExtent t="0" r="0" b="0" l="0"/>
             <wp:docPr id="1" name="" descr="" title=""/>
             <wp:cNvGraphicFramePr>
@@ -1145,7 +1145,7 @@
                   <pic:spPr bwMode="auto">
                     <a:xfrm>
                       <a:off x="0" y="0"/>
-                      <a:ext cx="5734050" cy="5095875"/>
+                      <a:ext cx="5734050" cy="5019675"/>
                     </a:xfrm>
                     <a:prstGeom prst="rect">
                       <a:avLst/>
@@ -1170,7 +1170,7 @@
           <w:sz w:val="18"/>
           <w:szCs w:val="18"/>
         </w:rPr>
-        <w:t xml:space="preserve">Figure 7A. Ezetimibe top DiffDock pose (confidence -1.32), converging within 3.5 A of the Vina-defined pocket.</w:t>
+        <w:t xml:space="preserve">Figure 7A. Ezetimibe top DiffDock pose (confidence -1.32), converging within 3.5 A of the Vina-defined pocket. Contact residues (&lt;4.5 A): Leu304, Leu312, Gly313, Ala314, Leu322, Ser323, Val324, Trp349, Trp350, Gly352, Thr353, His356.</w:t>
       </w:r>
     </w:p>
     <w:p>
@@ -1181,7 +1181,7 @@
       <w:r>
         <w:drawing>
           <wp:inline distT="0" distB="0" distL="0" distR="0">
-            <wp:extent cx="5734050" cy="5095875"/>
+            <wp:extent cx="5734050" cy="5019675"/>
             <wp:effectExtent t="0" r="0" b="0" l="0"/>
             <wp:docPr id="1" name="" descr="" title=""/>
             <wp:cNvGraphicFramePr>
@@ -1206,7 +1206,7 @@
                   <pic:spPr bwMode="auto">
                     <a:xfrm>
                       <a:off x="0" y="0"/>
-                      <a:ext cx="5734050" cy="5095875"/>
+                      <a:ext cx="5734050" cy="5019675"/>
                     </a:xfrm>
                     <a:prstGeom prst="rect">
                       <a:avLst/>
@@ -1231,7 +1231,7 @@
           <w:sz w:val="18"/>
           <w:szCs w:val="18"/>
         </w:rPr>
-        <w:t xml:space="preserve">Figure 7B. Resmetirom top DiffDock pose (confidence -2.06), 23.5 A from the Vina-defined pocket (a distinct site).</w:t>
+        <w:t xml:space="preserve">Figure 7B. Resmetirom top DiffDock pose (confidence -2.06), 23.5 A from the Vina-defined pocket (a distinct site). Contact residues (&lt;4.5 A): Trp280, Asp281, Ile367, Leu374, Tyr387, Tyr388, Pro389.</w:t>
       </w:r>
     </w:p>
     <w:p>

</xml_diff>